<commit_message>
Auto Backup: 2026/03/17 12:46:45.54
</commit_message>
<xml_diff>
--- a/Ritsumori cup2026/others/2026リツモリカップ予算書 v3.docx
+++ b/Ritsumori cup2026/others/2026リツモリカップ予算書 v3.docx
@@ -1389,7 +1389,7 @@
           <w:lang w:val="ja-JP"/>
         </w:rPr>
         <w:drawing>
-          <wp:inline distT="0" distB="0" distL="0" distR="0" wp14:anchorId="3C5EBF94" wp14:editId="1D7B4DBA">
+          <wp:inline distT="0" distB="0" distL="0" distR="0" wp14:anchorId="3C5EBF94" wp14:editId="6965C015">
             <wp:extent cx="2555377" cy="1260000"/>
             <wp:effectExtent l="0" t="0" r="0" b="0"/>
             <wp:docPr id="711816208" name="図 25"/>
@@ -1511,7 +1511,7 @@
           <w:noProof/>
         </w:rPr>
         <w:drawing>
-          <wp:inline distT="0" distB="0" distL="0" distR="0" wp14:anchorId="3A6C86D6" wp14:editId="4E5E94B2">
+          <wp:inline distT="0" distB="0" distL="0" distR="0" wp14:anchorId="3A6C86D6" wp14:editId="4269A182">
             <wp:extent cx="1410170" cy="1440000"/>
             <wp:effectExtent l="0" t="0" r="0" b="8255"/>
             <wp:docPr id="462311369" name="図 26"/>
@@ -1560,7 +1560,7 @@
           <w:noProof/>
         </w:rPr>
         <w:drawing>
-          <wp:inline distT="0" distB="0" distL="0" distR="0" wp14:anchorId="1D90B9C5" wp14:editId="47E8F07C">
+          <wp:inline distT="0" distB="0" distL="0" distR="0" wp14:anchorId="1D90B9C5" wp14:editId="33FE6B5D">
             <wp:extent cx="1445122" cy="1440000"/>
             <wp:effectExtent l="0" t="0" r="3175" b="8255"/>
             <wp:docPr id="686709779" name="図 27"/>
@@ -1609,7 +1609,7 @@
           <w:noProof/>
         </w:rPr>
         <w:drawing>
-          <wp:inline distT="0" distB="0" distL="0" distR="0" wp14:anchorId="54D4E4DF" wp14:editId="7B9CC2C5">
+          <wp:inline distT="0" distB="0" distL="0" distR="0" wp14:anchorId="54D4E4DF" wp14:editId="2EE22050">
             <wp:extent cx="1456291" cy="1440000"/>
             <wp:effectExtent l="0" t="0" r="0" b="8255"/>
             <wp:docPr id="1104969382" name="図 28"/>
@@ -1658,7 +1658,7 @@
           <w:noProof/>
         </w:rPr>
         <w:drawing>
-          <wp:inline distT="0" distB="0" distL="0" distR="0" wp14:anchorId="407D479A" wp14:editId="504ED70C">
+          <wp:inline distT="0" distB="0" distL="0" distR="0" wp14:anchorId="407D479A" wp14:editId="15EC8CCC">
             <wp:extent cx="2195915" cy="1620000"/>
             <wp:effectExtent l="0" t="0" r="0" b="0"/>
             <wp:docPr id="548123222" name="図 29"/>
@@ -1921,7 +1921,7 @@
           <w:lang w:val="ja-JP"/>
         </w:rPr>
         <w:drawing>
-          <wp:inline distT="0" distB="0" distL="0" distR="0" wp14:anchorId="357A87AC" wp14:editId="059F6E15">
+          <wp:inline distT="0" distB="0" distL="0" distR="0" wp14:anchorId="357A87AC" wp14:editId="3D197D66">
             <wp:extent cx="3373575" cy="1440000"/>
             <wp:effectExtent l="0" t="0" r="0" b="8255"/>
             <wp:docPr id="1053563436" name="図 4"/>
@@ -2516,7 +2516,7 @@
           <w:lang w:val="ja-JP"/>
         </w:rPr>
         <w:drawing>
-          <wp:inline distT="0" distB="0" distL="0" distR="0" wp14:anchorId="0689499B" wp14:editId="7DECEF26">
+          <wp:inline distT="0" distB="0" distL="0" distR="0" wp14:anchorId="0689499B" wp14:editId="3BCCDBD0">
             <wp:extent cx="3026480" cy="1620000"/>
             <wp:effectExtent l="0" t="0" r="2540" b="0"/>
             <wp:docPr id="1707771346" name="図 17"/>
@@ -2942,7 +2942,7 @@
           <w:lang w:val="ja-JP"/>
         </w:rPr>
         <w:drawing>
-          <wp:inline distT="0" distB="0" distL="0" distR="0" wp14:anchorId="50FAC0F8" wp14:editId="2EE40DAA">
+          <wp:inline distT="0" distB="0" distL="0" distR="0" wp14:anchorId="50FAC0F8" wp14:editId="5DDE7F77">
             <wp:extent cx="1747548" cy="1440000"/>
             <wp:effectExtent l="0" t="0" r="5080" b="8255"/>
             <wp:docPr id="1499463095" name="図 24"/>
@@ -2987,7 +2987,7 @@
     <w:p>
       <w:pPr>
         <w:rPr>
-          <w:rFonts w:ascii="メイリオ" w:eastAsia="メイリオ" w:hAnsi="メイリオ" w:cs="メイリオ"/>
+          <w:rFonts w:ascii="メイリオ" w:eastAsia="メイリオ" w:hAnsi="メイリオ" w:cs="メイリオ" w:hint="eastAsia"/>
         </w:rPr>
       </w:pPr>
       <w:r>
@@ -3742,7 +3742,7 @@
     <w:p>
       <w:pPr>
         <w:rPr>
-          <w:rFonts w:ascii="メイリオ" w:eastAsia="メイリオ" w:hAnsi="メイリオ" w:cs="メイリオ" w:hint="eastAsia"/>
+          <w:rFonts w:ascii="メイリオ" w:eastAsia="メイリオ" w:hAnsi="メイリオ" w:cs="メイリオ"/>
           <w:b/>
           <w:bCs/>
           <w:sz w:val="36"/>
@@ -3849,7 +3849,7 @@
       <w:pPr>
         <w:jc w:val="center"/>
         <w:rPr>
-          <w:rFonts w:ascii="メイリオ" w:eastAsia="メイリオ" w:hAnsi="メイリオ" w:cs="メイリオ" w:hint="eastAsia"/>
+          <w:rFonts w:ascii="メイリオ" w:eastAsia="メイリオ" w:hAnsi="メイリオ" w:cs="メイリオ"/>
           <w:b/>
           <w:bCs/>
           <w:sz w:val="28"/>
@@ -3912,7 +3912,7 @@
     <w:p>
       <w:pPr>
         <w:rPr>
-          <w:rFonts w:ascii="メイリオ" w:eastAsia="メイリオ" w:hAnsi="メイリオ" w:cs="メイリオ" w:hint="eastAsia"/>
+          <w:rFonts w:ascii="メイリオ" w:eastAsia="メイリオ" w:hAnsi="メイリオ" w:cs="メイリオ"/>
           <w:sz w:val="48"/>
           <w:szCs w:val="48"/>
         </w:rPr>
@@ -4593,6 +4593,7 @@
   <w:style w:type="character" w:default="1" w:styleId="a0">
     <w:name w:val="Default Paragraph Font"/>
     <w:uiPriority w:val="1"/>
+    <w:semiHidden/>
     <w:unhideWhenUsed/>
   </w:style>
   <w:style w:type="table" w:default="1" w:styleId="a1">

</xml_diff>